<commit_message>
feat: Add OSRM routing fallback to address map widget and introduce BFSI demo data, security privileges, and UI/logic updates for HR development.
</commit_message>
<xml_diff>
--- a/Reqtodo/Rvk req.docx
+++ b/Reqtodo/Rvk req.docx
@@ -1,6 +1,6 @@
 
 <file path=word/document.xml><?xml version="1.0" encoding="utf-8"?>
-<w:document xmlns:wpc="http://schemas.microsoft.com/office/word/2010/wordprocessingCanvas" xmlns:cx="http://schemas.microsoft.com/office/drawing/2014/chartex" xmlns:cx1="http://schemas.microsoft.com/office/drawing/2015/9/8/chartex" xmlns:cx2="http://schemas.microsoft.com/office/drawing/2015/10/21/chartex" xmlns:cx3="http://schemas.microsoft.com/office/drawing/2016/5/9/chartex" xmlns:cx4="http://schemas.microsoft.com/office/drawing/2016/5/10/chartex" xmlns:cx5="http://schemas.microsoft.com/office/drawing/2016/5/11/chartex" xmlns:cx6="http://schemas.microsoft.com/office/drawing/2016/5/12/chartex" xmlns:cx7="http://schemas.microsoft.com/office/drawing/2016/5/13/chartex" xmlns:cx8="http://schemas.microsoft.com/office/drawing/2016/5/14/chartex" xmlns:mc="http://schemas.openxmlformats.org/markup-compatibility/2006" xmlns:aink="http://schemas.microsoft.com/office/drawing/2016/ink" xmlns:am3d="http://schemas.microsoft.com/office/drawing/2017/model3d" xmlns:o="urn:schemas-microsoft-com:office:office" xmlns:oel="http://schemas.microsoft.com/office/2019/extlst" xmlns:r="http://schemas.openxmlformats.org/officeDocument/2006/relationships" xmlns:m="http://schemas.openxmlformats.org/officeDocument/2006/math" xmlns:v="urn:schemas-microsoft-com:vml" xmlns:wp14="http://schemas.microsoft.com/office/word/2010/wordprocessingDrawing" xmlns:wp="http://schemas.openxmlformats.org/drawingml/2006/wordprocessingDrawing" xmlns:w10="urn:schemas-microsoft-com:office:word" xmlns:w="http://schemas.openxmlformats.org/wordprocessingml/2006/main" xmlns:w14="http://schemas.microsoft.com/office/word/2010/wordml" xmlns:w15="http://schemas.microsoft.com/office/word/2012/wordml" xmlns:w16cex="http://schemas.microsoft.com/office/word/2018/wordml/cex" xmlns:w16cid="http://schemas.microsoft.com/office/word/2016/wordml/cid" xmlns:w16="http://schemas.microsoft.com/office/word/2018/wordml" xmlns:w16du="http://schemas.microsoft.com/office/word/2023/wordml/word16du" xmlns:w16sdtdh="http://schemas.microsoft.com/office/word/2020/wordml/sdtdatahash" xmlns:w16sdtfl="http://schemas.microsoft.com/office/word/2024/wordml/sdtformatlock" xmlns:w16se="http://schemas.microsoft.com/office/word/2015/wordml/symex" xmlns:wpg="http://schemas.microsoft.com/office/word/2010/wordprocessingGroup" xmlns:wpi="http://schemas.microsoft.com/office/word/2010/wordprocessingInk" xmlns:wne="http://schemas.microsoft.com/office/word/2006/wordml" xmlns:wps="http://schemas.microsoft.com/office/word/2010/wordprocessingShape" mc:Ignorable="w14 w15 w16se w16cid w16 w16cex w16sdtdh w16sdtfl w16du wp14">
+<w:document xmlns:wpc="http://schemas.microsoft.com/office/word/2010/wordprocessingCanvas" xmlns:cx="http://schemas.microsoft.com/office/drawing/2014/chartex" xmlns:cx1="http://schemas.microsoft.com/office/drawing/2015/9/8/chartex" xmlns:cx2="http://schemas.microsoft.com/office/drawing/2015/10/21/chartex" xmlns:cx3="http://schemas.microsoft.com/office/drawing/2016/5/9/chartex" xmlns:cx4="http://schemas.microsoft.com/office/drawing/2016/5/10/chartex" xmlns:cx5="http://schemas.microsoft.com/office/drawing/2016/5/11/chartex" xmlns:cx6="http://schemas.microsoft.com/office/drawing/2016/5/12/chartex" xmlns:cx7="http://schemas.microsoft.com/office/drawing/2016/5/13/chartex" xmlns:cx8="http://schemas.microsoft.com/office/drawing/2016/5/14/chartex" xmlns:mc="http://schemas.openxmlformats.org/markup-compatibility/2006" xmlns:aink="http://schemas.microsoft.com/office/drawing/2016/ink" xmlns:am3d="http://schemas.microsoft.com/office/drawing/2017/model3d" xmlns:o="urn:schemas-microsoft-com:office:office" xmlns:oel="http://schemas.microsoft.com/office/2019/extlst" xmlns:r="http://schemas.openxmlformats.org/officeDocument/2006/relationships" xmlns:m="http://schemas.openxmlformats.org/officeDocument/2006/math" xmlns:v="urn:schemas-microsoft-com:vml" xmlns:wp14="http://schemas.microsoft.com/office/word/2010/wordprocessingDrawing" xmlns:wp="http://schemas.openxmlformats.org/drawingml/2006/wordprocessingDrawing" xmlns:w10="urn:schemas-microsoft-com:office:word" xmlns:w="http://schemas.openxmlformats.org/wordprocessingml/2006/main" xmlns:w14="http://schemas.microsoft.com/office/word/2010/wordml" xmlns:w15="http://schemas.microsoft.com/office/word/2012/wordml" xmlns:w16cex="http://schemas.microsoft.com/office/word/2018/wordml/cex" xmlns:w16cid="http://schemas.microsoft.com/office/word/2016/wordml/cid" xmlns:w16="http://schemas.microsoft.com/office/word/2018/wordml" xmlns:w16sdtdh="http://schemas.microsoft.com/office/word/2020/wordml/sdtdatahash" xmlns:w16se="http://schemas.microsoft.com/office/word/2015/wordml/symex" xmlns:wpg="http://schemas.microsoft.com/office/word/2010/wordprocessingGroup" xmlns:wpi="http://schemas.microsoft.com/office/word/2010/wordprocessingInk" xmlns:wne="http://schemas.microsoft.com/office/word/2006/wordml" xmlns:wps="http://schemas.microsoft.com/office/word/2010/wordprocessingShape" mc:Ignorable="w14 w15 w16se w16cid w16 w16cex w16sdtdh wp14">
   <w:body>
     <w:p>
       <w:proofErr w:type="spellStart"/>
@@ -34,21 +34,32 @@
           <w:ilvl w:val="0"/>
           <w:numId w:val="1"/>
         </w:numPr>
-      </w:pPr>
-      <w:r>
+        <w:rPr>
+          <w:color w:val="3A7C22" w:themeColor="accent6" w:themeShade="BF"/>
+        </w:rPr>
+      </w:pPr>
+      <w:r>
+        <w:rPr>
+          <w:color w:val="3A7C22" w:themeColor="accent6" w:themeShade="BF"/>
+        </w:rPr>
         <w:t xml:space="preserve">Page Name: </w:t>
       </w:r>
       <w:r>
         <w:rPr>
+          <w:color w:val="3A7C22" w:themeColor="accent6" w:themeShade="BF"/>
           <w:highlight w:val="yellow"/>
         </w:rPr>
         <w:t>Flow Dashboard</w:t>
       </w:r>
       <w:r>
+        <w:rPr>
+          <w:color w:val="3A7C22" w:themeColor="accent6" w:themeShade="BF"/>
+        </w:rPr>
         <w:t xml:space="preserve"> change to </w:t>
       </w:r>
       <w:r>
         <w:rPr>
+          <w:color w:val="3A7C22" w:themeColor="accent6" w:themeShade="BF"/>
           <w:highlight w:val="yellow"/>
         </w:rPr>
         <w:t>Home Page</w:t>
@@ -63,15 +74,7 @@
         </w:numPr>
       </w:pPr>
       <w:r>
-        <w:t xml:space="preserve">Show </w:t>
-      </w:r>
-      <w:proofErr w:type="gramStart"/>
-      <w:r>
-        <w:t>User Name</w:t>
-      </w:r>
-      <w:proofErr w:type="gramEnd"/>
-      <w:r>
-        <w:t xml:space="preserve"> and Designated place of work </w:t>
+        <w:t xml:space="preserve">Show User Name and Designated place of work </w:t>
       </w:r>
       <w:r>
         <w:t xml:space="preserve">(Province) </w:t>
@@ -79,13 +82,8 @@
       <w:r>
         <w:t>for user at the top of the screen</w:t>
       </w:r>
-      <w:proofErr w:type="gramStart"/>
-      <w:r>
-        <w:t>:  This</w:t>
-      </w:r>
-      <w:proofErr w:type="gramEnd"/>
-      <w:r>
-        <w:t xml:space="preserve"> is used to filter what they see.</w:t>
+      <w:r>
+        <w:t>:  This is used to filter what they see.</w:t>
       </w:r>
     </w:p>
     <w:p>
@@ -121,15 +119,7 @@
         <w:t xml:space="preserve">The language option only translates some items.  </w:t>
       </w:r>
       <w:r>
-        <w:t xml:space="preserve">This </w:t>
-      </w:r>
-      <w:proofErr w:type="gramStart"/>
-      <w:r>
-        <w:t>has to</w:t>
-      </w:r>
-      <w:proofErr w:type="gramEnd"/>
-      <w:r>
-        <w:t xml:space="preserve"> work before we give it to staff to use/test. </w:t>
+        <w:t xml:space="preserve">This has to work before we give it to staff to use/test. </w:t>
       </w:r>
       <w:r>
         <w:t>(Please send me a copy of the language table)</w:t>
@@ -146,19 +136,11 @@
       <w:r>
         <w:t xml:space="preserve">Every screen should show the name of current page and have a </w:t>
       </w:r>
-      <w:proofErr w:type="gramStart"/>
       <w:r>
         <w:rPr>
           <w:highlight w:val="yellow"/>
         </w:rPr>
-        <w:t>back to home</w:t>
-      </w:r>
-      <w:proofErr w:type="gramEnd"/>
-      <w:r>
-        <w:rPr>
-          <w:highlight w:val="yellow"/>
-        </w:rPr>
-        <w:t xml:space="preserve"> page control</w:t>
+        <w:t>back to home page control</w:t>
       </w:r>
       <w:r>
         <w:t xml:space="preserve"> that works</w:t>
@@ -181,15 +163,7 @@
       </w:r>
       <w:proofErr w:type="gramEnd"/>
       <w:r>
-        <w:t xml:space="preserve"> name appears </w:t>
-      </w:r>
-      <w:proofErr w:type="gramStart"/>
-      <w:r>
-        <w:t>show</w:t>
-      </w:r>
-      <w:proofErr w:type="gramEnd"/>
-      <w:r>
-        <w:t xml:space="preserve"> the Client ID.</w:t>
+        <w:t xml:space="preserve"> name appears show the Client ID.</w:t>
       </w:r>
     </w:p>
     <w:p>
@@ -255,15 +229,7 @@
         </w:numPr>
       </w:pPr>
       <w:r>
-        <w:t>Address field</w:t>
-      </w:r>
-      <w:proofErr w:type="gramStart"/>
-      <w:r>
-        <w:t>:  can</w:t>
-      </w:r>
-      <w:proofErr w:type="gramEnd"/>
-      <w:r>
-        <w:t xml:space="preserve"> be used for facilities and for individuals.  Use a pop-up to display all the fields required to make a compound name field.  The individual fields making up the address are saved for each individual/clinic etc. but not displayed (and then only by pop-up) unless (a) entered first </w:t>
+        <w:t xml:space="preserve">Address field:  can be used for facilities and for individuals.  Use a pop-up to display all the fields required to make a compound name field.  The individual fields making up the address are saved for each individual/clinic etc. but not displayed (and then only by pop-up) unless (a) entered first </w:t>
       </w:r>
       <w:proofErr w:type="gramStart"/>
       <w:r>
@@ -838,7 +804,7 @@
                 <w:szCs w:val="22"/>
                 <w14:ligatures w14:val="none"/>
               </w:rPr>
-              <w:t>Note</w:t>
+              <w:t xml:space="preserve">Note:  the deceased flag is discrete </w:t>
             </w:r>
             <w:proofErr w:type="gramStart"/>
             <w:r>
@@ -850,7 +816,7 @@
                 <w:szCs w:val="22"/>
                 <w14:ligatures w14:val="none"/>
               </w:rPr>
-              <w:t>:  the</w:t>
+              <w:t>e.g.</w:t>
             </w:r>
             <w:proofErr w:type="gramEnd"/>
             <w:r>
@@ -862,7 +828,7 @@
                 <w:szCs w:val="22"/>
                 <w14:ligatures w14:val="none"/>
               </w:rPr>
-              <w:t xml:space="preserve"> deceased flag is discrete e.g. blank on the form with no label if false; international symbol for deceased if true</w:t>
+              <w:t xml:space="preserve"> blank on the form with no label if false; international symbol for deceased if true</w:t>
             </w:r>
           </w:p>
         </w:tc>
@@ -1212,31 +1178,7 @@
                 <w:szCs w:val="22"/>
                 <w14:ligatures w14:val="none"/>
               </w:rPr>
-              <w:t>General Requirement</w:t>
-            </w:r>
-            <w:proofErr w:type="gramStart"/>
-            <w:r>
-              <w:rPr>
-                <w:rFonts w:ascii="Aptos Narrow" w:eastAsia="Times New Roman" w:hAnsi="Aptos Narrow" w:cs="Times New Roman"/>
-                <w:color w:val="000000"/>
-                <w:kern w:val="0"/>
-                <w:sz w:val="22"/>
-                <w:szCs w:val="22"/>
-                <w14:ligatures w14:val="none"/>
-              </w:rPr>
-              <w:t>:  Add</w:t>
-            </w:r>
-            <w:proofErr w:type="gramEnd"/>
-            <w:r>
-              <w:rPr>
-                <w:rFonts w:ascii="Aptos Narrow" w:eastAsia="Times New Roman" w:hAnsi="Aptos Narrow" w:cs="Times New Roman"/>
-                <w:color w:val="000000"/>
-                <w:kern w:val="0"/>
-                <w:sz w:val="22"/>
-                <w:szCs w:val="22"/>
-                <w14:ligatures w14:val="none"/>
-              </w:rPr>
-              <w:t xml:space="preserve"> a Related Person without reference to a client.  Examples: 3rd party payers (contracts); new referrers who have not referred yet or other types of individuals.  </w:t>
+              <w:t xml:space="preserve">General Requirement:  Add a Related Person without reference to a client.  Examples: 3rd party payers (contracts); new referrers who have not referred yet or other types of individuals.  </w:t>
             </w:r>
           </w:p>
         </w:tc>
@@ -3240,31 +3182,7 @@
                 <w:szCs w:val="22"/>
                 <w14:ligatures w14:val="none"/>
               </w:rPr>
-              <w:t xml:space="preserve">Add One </w:t>
-            </w:r>
-            <w:proofErr w:type="gramStart"/>
-            <w:r>
-              <w:rPr>
-                <w:rFonts w:ascii="Aptos Narrow" w:eastAsia="Times New Roman" w:hAnsi="Aptos Narrow" w:cs="Times New Roman"/>
-                <w:color w:val="000000"/>
-                <w:kern w:val="0"/>
-                <w:sz w:val="22"/>
-                <w:szCs w:val="22"/>
-                <w14:ligatures w14:val="none"/>
-              </w:rPr>
-              <w:t>way road</w:t>
-            </w:r>
-            <w:proofErr w:type="gramEnd"/>
-            <w:r>
-              <w:rPr>
-                <w:rFonts w:ascii="Aptos Narrow" w:eastAsia="Times New Roman" w:hAnsi="Aptos Narrow" w:cs="Times New Roman"/>
-                <w:color w:val="000000"/>
-                <w:kern w:val="0"/>
-                <w:sz w:val="22"/>
-                <w:szCs w:val="22"/>
-                <w14:ligatures w14:val="none"/>
-              </w:rPr>
-              <w:t xml:space="preserve"> Distance from Facility</w:t>
+              <w:t>Add One way road Distance from Facility</w:t>
             </w:r>
           </w:p>
         </w:tc>
@@ -3942,6 +3860,8 @@
           <w:bCs/>
         </w:rPr>
       </w:pPr>
+      <w:bookmarkStart w:id="0" w:name="OLE_LINK2"/>
+      <w:bookmarkStart w:id="1" w:name="OLE_LINK3"/>
       <w:r>
         <w:rPr>
           <w:b/>
@@ -3986,6 +3906,7 @@
         </w:rPr>
         <w:t xml:space="preserve"> to </w:t>
       </w:r>
+      <w:bookmarkStart w:id="2" w:name="OLE_LINK1"/>
       <w:r>
         <w:rPr>
           <w:b/>
@@ -3994,6 +3915,7 @@
         </w:rPr>
         <w:t>Sales &amp; CRM</w:t>
       </w:r>
+      <w:bookmarkEnd w:id="2"/>
     </w:p>
     <w:p>
       <w:pPr>
@@ -4005,15 +3927,7 @@
         <w:ind w:left="1080"/>
       </w:pPr>
       <w:r>
-        <w:t>Sub-menus</w:t>
-      </w:r>
-      <w:proofErr w:type="gramStart"/>
-      <w:r>
-        <w:t>:  Only</w:t>
-      </w:r>
-      <w:proofErr w:type="gramEnd"/>
-      <w:r>
-        <w:t xml:space="preserve"> two options here:  </w:t>
+        <w:t xml:space="preserve">Sub-menus:  Only two options here:  </w:t>
       </w:r>
     </w:p>
     <w:p>
@@ -4284,29 +4198,13 @@
       </w:r>
       <w:proofErr w:type="gramEnd"/>
       <w:r>
-        <w:t xml:space="preserve"> selected from </w:t>
-      </w:r>
-      <w:proofErr w:type="gramStart"/>
-      <w:r>
-        <w:t>the a</w:t>
-      </w:r>
-      <w:proofErr w:type="gramEnd"/>
-      <w:r>
-        <w:t xml:space="preserve"> Contacts</w:t>
-      </w:r>
-      <w:r>
-        <w:t xml:space="preserve"> </w:t>
-      </w:r>
-      <w:proofErr w:type="gramStart"/>
-      <w:r>
-        <w:t xml:space="preserve">Details </w:t>
-      </w:r>
-      <w:r>
-        <w:t xml:space="preserve"> form</w:t>
-      </w:r>
-      <w:proofErr w:type="gramEnd"/>
-      <w:r>
-        <w:t xml:space="preserve"> the current </w:t>
+        <w:t xml:space="preserve"> selected from the a Contacts</w:t>
+      </w:r>
+      <w:r>
+        <w:t xml:space="preserve"> Details </w:t>
+      </w:r>
+      <w:r>
+        <w:t xml:space="preserve"> form the current </w:t>
       </w:r>
       <w:r>
         <w:t>contact</w:t>
@@ -4418,6 +4316,7 @@
         </w:numPr>
         <w:ind w:left="2520"/>
       </w:pPr>
+      <w:bookmarkStart w:id="3" w:name="OLE_LINK4"/>
       <w:r>
         <w:t xml:space="preserve">Show Calendar (displays all current leads to follow up and </w:t>
       </w:r>
@@ -4430,6 +4329,7 @@
         <w:t xml:space="preserve"> shows the lead follow-up form or activity follow-up form. </w:t>
       </w:r>
     </w:p>
+    <w:bookmarkEnd w:id="3"/>
     <w:p>
       <w:pPr>
         <w:pStyle w:val="ListParagraph"/>
@@ -4749,15 +4649,7 @@
         <w:t xml:space="preserve"> or back to booking page controls</w:t>
       </w:r>
       <w:r>
-        <w:t xml:space="preserve">. Also add commission fields: Commission Due to; % commission; commission payment </w:t>
-      </w:r>
-      <w:proofErr w:type="gramStart"/>
-      <w:r>
-        <w:t>duration;</w:t>
-      </w:r>
-      <w:proofErr w:type="gramEnd"/>
-      <w:r>
-        <w:t xml:space="preserve"> </w:t>
+        <w:t xml:space="preserve">. Also add commission fields: Commission Due to; % commission; commission payment duration; </w:t>
       </w:r>
     </w:p>
     <w:p>
@@ -4791,23 +4683,7 @@
       </w:r>
       <w:r>
         <w:br/>
-        <w:t xml:space="preserve">Not compulsory but Sales can assign a </w:t>
-      </w:r>
-      <w:proofErr w:type="gramStart"/>
-      <w:r>
-        <w:t>nurse</w:t>
-      </w:r>
-      <w:proofErr w:type="gramEnd"/>
-      <w:r>
-        <w:t xml:space="preserve"> so this </w:t>
-      </w:r>
-      <w:proofErr w:type="gramStart"/>
-      <w:r>
-        <w:t>is for convenience</w:t>
-      </w:r>
-      <w:proofErr w:type="gramEnd"/>
-      <w:r>
-        <w:t xml:space="preserve"> at this stage</w:t>
+        <w:t>Not compulsory but Sales can assign a nurse so this is for convenience at this stage</w:t>
       </w:r>
       <w:r>
         <w:t xml:space="preserve">.  </w:t>
@@ -4947,15 +4823,7 @@
         </w:numPr>
       </w:pPr>
       <w:r>
-        <w:t xml:space="preserve">If this is not a new client first visit: who was the last person </w:t>
-      </w:r>
-      <w:proofErr w:type="gramStart"/>
-      <w:r>
-        <w:t>visit</w:t>
-      </w:r>
-      <w:proofErr w:type="gramEnd"/>
-      <w:r>
-        <w:t xml:space="preserve"> this client.</w:t>
+        <w:t>If this is not a new client first visit: who was the last person visit this client.</w:t>
       </w:r>
     </w:p>
     <w:p>
@@ -5038,8 +4906,6 @@
       </w:r>
       <w:r>
         <w:br/>
-      </w:r>
-      <w:r>
         <w:t>Head Nurse, or OM</w:t>
       </w:r>
     </w:p>
@@ -5119,15 +4985,7 @@
         <w:ind w:left="2520"/>
       </w:pPr>
       <w:r>
-        <w:t>Contact Status Field</w:t>
-      </w:r>
-      <w:proofErr w:type="gramStart"/>
-      <w:r>
-        <w:t>:  Active</w:t>
-      </w:r>
-      <w:proofErr w:type="gramEnd"/>
-      <w:r>
-        <w:t>, Booking, Lead, Lost Booking, Spam Call</w:t>
+        <w:t>Contact Status Field:  Active, Booking, Lead, Lost Booking, Spam Call</w:t>
       </w:r>
     </w:p>
     <w:p>
@@ -5174,6 +5032,8 @@
         <w:t>as above</w:t>
       </w:r>
     </w:p>
+    <w:bookmarkEnd w:id="0"/>
+    <w:bookmarkEnd w:id="1"/>
     <w:p>
       <w:pPr>
         <w:pStyle w:val="ListParagraph"/>
@@ -5191,7 +5051,7 @@
 </file>
 
 <file path=word/numbering.xml><?xml version="1.0" encoding="utf-8"?>
-<w:numbering xmlns:wpc="http://schemas.microsoft.com/office/word/2010/wordprocessingCanvas" xmlns:cx="http://schemas.microsoft.com/office/drawing/2014/chartex" xmlns:cx1="http://schemas.microsoft.com/office/drawing/2015/9/8/chartex" xmlns:cx2="http://schemas.microsoft.com/office/drawing/2015/10/21/chartex" xmlns:cx3="http://schemas.microsoft.com/office/drawing/2016/5/9/chartex" xmlns:cx4="http://schemas.microsoft.com/office/drawing/2016/5/10/chartex" xmlns:cx5="http://schemas.microsoft.com/office/drawing/2016/5/11/chartex" xmlns:cx6="http://schemas.microsoft.com/office/drawing/2016/5/12/chartex" xmlns:cx7="http://schemas.microsoft.com/office/drawing/2016/5/13/chartex" xmlns:cx8="http://schemas.microsoft.com/office/drawing/2016/5/14/chartex" xmlns:mc="http://schemas.openxmlformats.org/markup-compatibility/2006" xmlns:aink="http://schemas.microsoft.com/office/drawing/2016/ink" xmlns:am3d="http://schemas.microsoft.com/office/drawing/2017/model3d" xmlns:o="urn:schemas-microsoft-com:office:office" xmlns:oel="http://schemas.microsoft.com/office/2019/extlst" xmlns:r="http://schemas.openxmlformats.org/officeDocument/2006/relationships" xmlns:m="http://schemas.openxmlformats.org/officeDocument/2006/math" xmlns:v="urn:schemas-microsoft-com:vml" xmlns:wp14="http://schemas.microsoft.com/office/word/2010/wordprocessingDrawing" xmlns:wp="http://schemas.openxmlformats.org/drawingml/2006/wordprocessingDrawing" xmlns:w10="urn:schemas-microsoft-com:office:word" xmlns:w="http://schemas.openxmlformats.org/wordprocessingml/2006/main" xmlns:w14="http://schemas.microsoft.com/office/word/2010/wordml" xmlns:w15="http://schemas.microsoft.com/office/word/2012/wordml" xmlns:w16cex="http://schemas.microsoft.com/office/word/2018/wordml/cex" xmlns:w16cid="http://schemas.microsoft.com/office/word/2016/wordml/cid" xmlns:w16="http://schemas.microsoft.com/office/word/2018/wordml" xmlns:w16du="http://schemas.microsoft.com/office/word/2023/wordml/word16du" xmlns:w16sdtdh="http://schemas.microsoft.com/office/word/2020/wordml/sdtdatahash" xmlns:w16sdtfl="http://schemas.microsoft.com/office/word/2024/wordml/sdtformatlock" xmlns:w16se="http://schemas.microsoft.com/office/word/2015/wordml/symex" xmlns:wpg="http://schemas.microsoft.com/office/word/2010/wordprocessingGroup" xmlns:wpi="http://schemas.microsoft.com/office/word/2010/wordprocessingInk" xmlns:wne="http://schemas.microsoft.com/office/word/2006/wordml" xmlns:wps="http://schemas.microsoft.com/office/word/2010/wordprocessingShape" mc:Ignorable="w14 w15 w16se w16cid w16 w16cex w16sdtdh w16sdtfl w16du wp14">
+<w:numbering xmlns:wpc="http://schemas.microsoft.com/office/word/2010/wordprocessingCanvas" xmlns:cx="http://schemas.microsoft.com/office/drawing/2014/chartex" xmlns:cx1="http://schemas.microsoft.com/office/drawing/2015/9/8/chartex" xmlns:cx2="http://schemas.microsoft.com/office/drawing/2015/10/21/chartex" xmlns:cx3="http://schemas.microsoft.com/office/drawing/2016/5/9/chartex" xmlns:cx4="http://schemas.microsoft.com/office/drawing/2016/5/10/chartex" xmlns:cx5="http://schemas.microsoft.com/office/drawing/2016/5/11/chartex" xmlns:cx6="http://schemas.microsoft.com/office/drawing/2016/5/12/chartex" xmlns:cx7="http://schemas.microsoft.com/office/drawing/2016/5/13/chartex" xmlns:cx8="http://schemas.microsoft.com/office/drawing/2016/5/14/chartex" xmlns:mc="http://schemas.openxmlformats.org/markup-compatibility/2006" xmlns:aink="http://schemas.microsoft.com/office/drawing/2016/ink" xmlns:am3d="http://schemas.microsoft.com/office/drawing/2017/model3d" xmlns:o="urn:schemas-microsoft-com:office:office" xmlns:oel="http://schemas.microsoft.com/office/2019/extlst" xmlns:r="http://schemas.openxmlformats.org/officeDocument/2006/relationships" xmlns:m="http://schemas.openxmlformats.org/officeDocument/2006/math" xmlns:v="urn:schemas-microsoft-com:vml" xmlns:wp14="http://schemas.microsoft.com/office/word/2010/wordprocessingDrawing" xmlns:wp="http://schemas.openxmlformats.org/drawingml/2006/wordprocessingDrawing" xmlns:w10="urn:schemas-microsoft-com:office:word" xmlns:w="http://schemas.openxmlformats.org/wordprocessingml/2006/main" xmlns:w14="http://schemas.microsoft.com/office/word/2010/wordml" xmlns:w15="http://schemas.microsoft.com/office/word/2012/wordml" xmlns:w16cex="http://schemas.microsoft.com/office/word/2018/wordml/cex" xmlns:w16cid="http://schemas.microsoft.com/office/word/2016/wordml/cid" xmlns:w16="http://schemas.microsoft.com/office/word/2018/wordml" xmlns:w16sdtdh="http://schemas.microsoft.com/office/word/2020/wordml/sdtdatahash" xmlns:w16se="http://schemas.microsoft.com/office/word/2015/wordml/symex" xmlns:wpg="http://schemas.microsoft.com/office/word/2010/wordprocessingGroup" xmlns:wpi="http://schemas.microsoft.com/office/word/2010/wordprocessingInk" xmlns:wne="http://schemas.microsoft.com/office/word/2006/wordml" xmlns:wps="http://schemas.microsoft.com/office/word/2010/wordprocessingShape" mc:Ignorable="w14 w15 w16se w16cid w16 w16cex w16sdtdh wp14">
   <w:abstractNum w:abstractNumId="0" w15:restartNumberingAfterBreak="0">
     <w:nsid w:val="21AC6EE4"/>
     <w:multiLevelType w:val="hybridMultilevel"/>
@@ -5220,7 +5080,7 @@
       <w:lvlText w:val="%3."/>
       <w:lvlJc w:val="right"/>
       <w:pPr>
-        <w:ind w:left="2160" w:hanging="180"/>
+        <w:ind w:left="464" w:hanging="180"/>
       </w:pPr>
     </w:lvl>
     <w:lvl w:ilvl="3" w:tplc="0409000F">
@@ -5285,7 +5145,7 @@
 </file>
 
 <file path=word/styles.xml><?xml version="1.0" encoding="utf-8"?>
-<w:styles xmlns:mc="http://schemas.openxmlformats.org/markup-compatibility/2006" xmlns:r="http://schemas.openxmlformats.org/officeDocument/2006/relationships" xmlns:w="http://schemas.openxmlformats.org/wordprocessingml/2006/main" xmlns:w14="http://schemas.microsoft.com/office/word/2010/wordml" xmlns:w15="http://schemas.microsoft.com/office/word/2012/wordml" xmlns:w16cex="http://schemas.microsoft.com/office/word/2018/wordml/cex" xmlns:w16cid="http://schemas.microsoft.com/office/word/2016/wordml/cid" xmlns:w16="http://schemas.microsoft.com/office/word/2018/wordml" xmlns:w16du="http://schemas.microsoft.com/office/word/2023/wordml/word16du" xmlns:w16sdtdh="http://schemas.microsoft.com/office/word/2020/wordml/sdtdatahash" xmlns:w16sdtfl="http://schemas.microsoft.com/office/word/2024/wordml/sdtformatlock" xmlns:w16se="http://schemas.microsoft.com/office/word/2015/wordml/symex" mc:Ignorable="w14 w15 w16se w16cid w16 w16cex w16sdtdh w16sdtfl w16du">
+<w:styles xmlns:mc="http://schemas.openxmlformats.org/markup-compatibility/2006" xmlns:r="http://schemas.openxmlformats.org/officeDocument/2006/relationships" xmlns:w="http://schemas.openxmlformats.org/wordprocessingml/2006/main" xmlns:w14="http://schemas.microsoft.com/office/word/2010/wordml" xmlns:w15="http://schemas.microsoft.com/office/word/2012/wordml" xmlns:w16cex="http://schemas.microsoft.com/office/word/2018/wordml/cex" xmlns:w16cid="http://schemas.microsoft.com/office/word/2016/wordml/cid" xmlns:w16="http://schemas.microsoft.com/office/word/2018/wordml" xmlns:w16sdtdh="http://schemas.microsoft.com/office/word/2020/wordml/sdtdatahash" xmlns:w16se="http://schemas.microsoft.com/office/word/2015/wordml/symex" mc:Ignorable="w14 w15 w16se w16cid w16 w16cex w16sdtdh">
   <w:docDefaults>
     <w:rPrDefault>
       <w:rPr>

</xml_diff>